<commit_message>
Polish Practice 4 report for submission
</commit_message>
<xml_diff>
--- a/reports/Practice_4_Polyanskiy.docx
+++ b/reports/Practice_4_Polyanskiy.docx
@@ -911,7 +911,7 @@
         <w:jc w:val="both"/>
       </w:pPr>
       <w:r>
-        <w:t>Пример другого учащегося использован только для понимания структуры отчёта. Его предметная область и код не перенесены: проект продолжает собственное приложение «Языки программирования» Полянского Максима Дмитриевича, ИКБО-65-23.</w:t>
+        <w:t>Я сохранил тему прошлой работы — «Языки программирования» — и дополнил готовый экран двумя списками. В галерее и карточках представлены одни и те же пять языков: Dart, Python, Java, C++ и JavaScript.</w:t>
       </w:r>
     </w:p>
     <w:p>
@@ -977,6 +977,7 @@
       <w:pPr>
         <w:pStyle w:val="ReportCode"/>
         <w:jc w:val="left"/>
+        <w:shd w:fill="F2F2F2"/>
       </w:pPr>
       <w:r>
         <w:t>practice4/</w:t>
@@ -986,6 +987,7 @@
       <w:pPr>
         <w:pStyle w:val="ReportCode"/>
         <w:jc w:val="left"/>
+        <w:shd w:fill="F2F2F2"/>
       </w:pPr>
       <w:r>
         <w:t xml:space="preserve">  lib/main.dart                 # экран и обработчик карточек</w:t>
@@ -995,6 +997,7 @@
       <w:pPr>
         <w:pStyle w:val="ReportCode"/>
         <w:jc w:val="left"/>
+        <w:shd w:fill="F2F2F2"/>
       </w:pPr>
       <w:r>
         <w:t xml:space="preserve">  assets/images/*.png          # пять изображений языков</w:t>
@@ -1004,6 +1007,7 @@
       <w:pPr>
         <w:pStyle w:val="ReportCode"/>
         <w:jc w:val="left"/>
+        <w:shd w:fill="F2F2F2"/>
       </w:pPr>
       <w:r>
         <w:t xml:space="preserve">  assets/fonts/NotoSans-Bold.ttf # шрифт заголовка</w:t>
@@ -1013,6 +1017,7 @@
       <w:pPr>
         <w:pStyle w:val="ReportCode"/>
         <w:jc w:val="left"/>
+        <w:shd w:fill="F2F2F2"/>
       </w:pPr>
       <w:r>
         <w:t xml:space="preserve">  assets/fonts/OFL.txt         # лицензия шрифта</w:t>
@@ -1022,6 +1027,7 @@
       <w:pPr>
         <w:pStyle w:val="ReportCode"/>
         <w:jc w:val="left"/>
+        <w:shd w:fill="F2F2F2"/>
       </w:pPr>
       <w:r>
         <w:t xml:space="preserve">  pubspec.yaml                 # объявление ресурсов</w:t>
@@ -1031,6 +1037,7 @@
       <w:pPr>
         <w:pStyle w:val="ReportCode"/>
         <w:jc w:val="left"/>
+        <w:shd w:fill="F2F2F2"/>
       </w:pPr>
       <w:r>
         <w:t xml:space="preserve">  test/widget_test.dart        # проверки интерфейса</w:t>
@@ -1069,7 +1076,7 @@
         <w:jc w:val="both"/>
       </w:pPr>
       <w:r>
-        <w:t>Каждый элемент галереи имеет ширину 190 пикселей на обычном экране. Внутри Card показаны PNG и название языка. ClipRRect с BorderRadius.circular(14) обрезает картинку по скруглённому контуру; значение Image.asset берётся из поля language.image. На экране шириной 430 пикселей одновременно видны первые две карточки и начало третьей, что подсказывает о возможности горизонтальной прокрутки.</w:t>
+        <w:t>В каждой карточке галереи показаны изображение и название языка. Картинка загружается из локальных ресурсов через Image.asset. Виджет ClipRRect обрезает её по скруглённым углам. Листая галерею в сторону, можно увидеть остальные языки.</w:t>
       </w:r>
     </w:p>
     <w:p>
@@ -1123,7 +1130,7 @@
         <w:jc w:val="both"/>
       </w:pPr>
       <w:r>
-        <w:t>LayoutBuilder передаёт доступную высоту. Если она меньше 600 пикселей, приложение использует меньшие высоту и ширину карточек галереи, уменьшенный размер заголовка и краткое описание. На экране 320 × 480 пикселей оба списка и данные студента остаются доступными. Условие compact меняет только размеры и длину описания; содержимое коллекции не меняется.</w:t>
+        <w:t>Для небольшого окна предусмотрен компактный вариант экрана: галерея становится ниже, заголовок и описание занимают меньше места. Вертикальный список использует оставшуюся область и при необходимости прокручивается. Содержимое карточек при этом сохраняется.</w:t>
       </w:r>
     </w:p>
     <w:p>
@@ -1139,6 +1146,7 @@
       <w:pPr>
         <w:pStyle w:val="ReportCode"/>
         <w:jc w:val="left"/>
+        <w:shd w:fill="F2F2F2"/>
       </w:pPr>
       <w:r>
         <w:t>flutter pub get</w:t>
@@ -1148,6 +1156,7 @@
       <w:pPr>
         <w:pStyle w:val="ReportCode"/>
         <w:jc w:val="left"/>
+        <w:shd w:fill="F2F2F2"/>
       </w:pPr>
       <w:r>
         <w:t>flutter run -d web-server --web-port 8314</w:t>
@@ -1156,8 +1165,9 @@
     <w:p>
       <w:pPr>
         <w:pStyle w:val="ReportCode"/>
+        <w:jc w:val="left"/>
         <w:keepNext/>
-        <w:jc w:val="left"/>
+        <w:shd w:fill="F2F2F2"/>
       </w:pPr>
       <w:r>
         <w:t># Открыть http://127.0.0.1:8314 в браузере</w:t>
@@ -1167,6 +1177,7 @@
       <w:pPr>
         <w:pStyle w:val="ReportCode"/>
         <w:jc w:val="left"/>
+        <w:shd w:fill="F2F2F2"/>
       </w:pPr>
       <w:r>
         <w:t>flutter analyze</w:t>
@@ -1176,6 +1187,7 @@
       <w:pPr>
         <w:pStyle w:val="ReportCode"/>
         <w:jc w:val="left"/>
+        <w:shd w:fill="F2F2F2"/>
       </w:pPr>
       <w:r>
         <w:t>flutter test</w:t>
@@ -1185,6 +1197,7 @@
       <w:pPr>
         <w:pStyle w:val="ReportCode"/>
         <w:jc w:val="left"/>
+        <w:shd w:fill="F2F2F2"/>
       </w:pPr>
       <w:r>
         <w:t>flutter build apk --debug</w:t>
@@ -1196,7 +1209,7 @@
         <w:jc w:val="both"/>
       </w:pPr>
       <w:r>
-        <w:t>Скриншоты сняты с реально запущенной веб-версии Flutter в Google Chrome. Размер основной области — 430 × 800 пикселей; для проверки компактного режима использована область 320 × 480 пикселей. Android debug APK собран отдельно, но запуск на Android-устройстве не выполнялся.</w:t>
+        <w:t>После запуска приложения я проверил оба списка и уведомления в браузере. Дополнительно собрал Android APK для установки приложения. Скриншоты работы приведены ниже.</w:t>
       </w:r>
     </w:p>
     <w:p>
@@ -1445,7 +1458,7 @@
         <w:jc w:val="left"/>
       </w:pPr>
       <w:r>
-        <w:t>9.3 Уведомление и компактный экран</w:t>
+        <w:t>9.3 Уведомление и работа в небольшом окне</w:t>
       </w:r>
     </w:p>
     <w:p>
@@ -1454,7 +1467,7 @@
         <w:jc w:val="both"/>
       </w:pPr>
       <w:r>
-        <w:t>Слева показано уведомление после нажатия на Dart. Справа — экран при размере 320 × 480 пикселей: интерфейс сокращает описание и размеры галереи, при этом карточка и данные студента видны без переполнения.</w:t>
+        <w:t>Слева показано уведомление после выбора Dart. Справа видно, как экран выглядит в небольшом окне: галерея и описание занимают меньше места, а список карточек остаётся доступным.</w:t>
       </w:r>
     </w:p>
     <w:p>
@@ -1869,13 +1882,14 @@
         <w:jc w:val="both"/>
       </w:pPr>
       <w:r>
-        <w:t>Ниже приведён весь файл lib/main.dart. Короткие комментарии отмечают места, по которым могут спросить на защите: модель данных, построение двух списков, ограничение высоты галереи, скругление, обработчик onTap, setState и ScaffoldMessenger. Листинг совпадает с исходным файлом проекта и репозитория.</w:t>
-      </w:r>
-    </w:p>
-    <w:p>
-      <w:pPr>
-        <w:pStyle w:val="ReportCode"/>
-        <w:jc w:val="left"/>
+        <w:t>Ниже приведён полный файл lib/main.dart. Комментарии в коде поясняют назначение модели данных, двух списков, обработки нажатия и показа уведомления. Листинг совпадает с исходным файлом проекта.</w:t>
+      </w:r>
+    </w:p>
+    <w:p>
+      <w:pPr>
+        <w:pStyle w:val="ReportCode"/>
+        <w:jc w:val="left"/>
+        <w:shd w:fill="F2F2F2"/>
       </w:pPr>
       <w:r>
         <w:t>import 'package:flutter/material.dart';</w:t>
@@ -1885,12 +1899,14 @@
       <w:pPr>
         <w:pStyle w:val="ReportCode"/>
         <w:jc w:val="left"/>
-      </w:pPr>
-    </w:p>
-    <w:p>
-      <w:pPr>
-        <w:pStyle w:val="ReportCode"/>
-        <w:jc w:val="left"/>
+        <w:shd w:fill="F2F2F2"/>
+      </w:pPr>
+    </w:p>
+    <w:p>
+      <w:pPr>
+        <w:pStyle w:val="ReportCode"/>
+        <w:jc w:val="left"/>
+        <w:shd w:fill="F2F2F2"/>
       </w:pPr>
       <w:r>
         <w:t>void main() =&gt; runApp(const ProgrammingLanguagesApp());</w:t>
@@ -1900,13 +1916,15 @@
       <w:pPr>
         <w:pStyle w:val="ReportCode"/>
         <w:jc w:val="left"/>
-      </w:pPr>
-    </w:p>
-    <w:p>
-      <w:pPr>
-        <w:pStyle w:val="ReportCode"/>
+        <w:shd w:fill="F2F2F2"/>
+      </w:pPr>
+    </w:p>
+    <w:p>
+      <w:pPr>
+        <w:pStyle w:val="ReportCode"/>
+        <w:jc w:val="left"/>
         <w:keepNext/>
-        <w:jc w:val="left"/>
+        <w:shd w:fill="F2F2F2"/>
       </w:pPr>
       <w:r>
         <w:t>// Данные одного пункта: название, подпись, картинка и значок.</w:t>
@@ -1916,6 +1934,7 @@
       <w:pPr>
         <w:pStyle w:val="ReportCode"/>
         <w:jc w:val="left"/>
+        <w:shd w:fill="F2F2F2"/>
       </w:pPr>
       <w:r>
         <w:t>class LanguageInfo {</w:t>
@@ -1925,6 +1944,7 @@
       <w:pPr>
         <w:pStyle w:val="ReportCode"/>
         <w:jc w:val="left"/>
+        <w:shd w:fill="F2F2F2"/>
       </w:pPr>
       <w:r>
         <w:t xml:space="preserve">  const LanguageInfo(this.name, this.description, this.image, this.icon);</w:t>
@@ -1934,12 +1954,14 @@
       <w:pPr>
         <w:pStyle w:val="ReportCode"/>
         <w:jc w:val="left"/>
-      </w:pPr>
-    </w:p>
-    <w:p>
-      <w:pPr>
-        <w:pStyle w:val="ReportCode"/>
-        <w:jc w:val="left"/>
+        <w:shd w:fill="F2F2F2"/>
+      </w:pPr>
+    </w:p>
+    <w:p>
+      <w:pPr>
+        <w:pStyle w:val="ReportCode"/>
+        <w:jc w:val="left"/>
+        <w:shd w:fill="F2F2F2"/>
       </w:pPr>
       <w:r>
         <w:t xml:space="preserve">  final String name;</w:t>
@@ -1949,6 +1971,7 @@
       <w:pPr>
         <w:pStyle w:val="ReportCode"/>
         <w:jc w:val="left"/>
+        <w:shd w:fill="F2F2F2"/>
       </w:pPr>
       <w:r>
         <w:t xml:space="preserve">  final String description;</w:t>
@@ -1958,6 +1981,7 @@
       <w:pPr>
         <w:pStyle w:val="ReportCode"/>
         <w:jc w:val="left"/>
+        <w:shd w:fill="F2F2F2"/>
       </w:pPr>
       <w:r>
         <w:t xml:space="preserve">  final String image;</w:t>
@@ -1967,6 +1991,7 @@
       <w:pPr>
         <w:pStyle w:val="ReportCode"/>
         <w:jc w:val="left"/>
+        <w:shd w:fill="F2F2F2"/>
       </w:pPr>
       <w:r>
         <w:t xml:space="preserve">  final IconData icon;</w:t>
@@ -1976,6 +2001,7 @@
       <w:pPr>
         <w:pStyle w:val="ReportCode"/>
         <w:jc w:val="left"/>
+        <w:shd w:fill="F2F2F2"/>
       </w:pPr>
       <w:r>
         <w:t>}</w:t>
@@ -1985,13 +2011,15 @@
       <w:pPr>
         <w:pStyle w:val="ReportCode"/>
         <w:jc w:val="left"/>
-      </w:pPr>
-    </w:p>
-    <w:p>
-      <w:pPr>
-        <w:pStyle w:val="ReportCode"/>
+        <w:shd w:fill="F2F2F2"/>
+      </w:pPr>
+    </w:p>
+    <w:p>
+      <w:pPr>
+        <w:pStyle w:val="ReportCode"/>
+        <w:jc w:val="left"/>
         <w:keepNext/>
-        <w:jc w:val="left"/>
+        <w:shd w:fill="F2F2F2"/>
       </w:pPr>
       <w:r>
         <w:t>// Порядок элементов определяет порядок и галереи, и списка.</w:t>
@@ -2001,6 +2029,7 @@
       <w:pPr>
         <w:pStyle w:val="ReportCode"/>
         <w:jc w:val="left"/>
+        <w:shd w:fill="F2F2F2"/>
       </w:pPr>
       <w:r>
         <w:t>const languages = &lt;LanguageInfo&gt;[</w:t>
@@ -2010,6 +2039,7 @@
       <w:pPr>
         <w:pStyle w:val="ReportCode"/>
         <w:jc w:val="left"/>
+        <w:shd w:fill="F2F2F2"/>
       </w:pPr>
       <w:r>
         <w:t xml:space="preserve">  LanguageInfo(</w:t>
@@ -2019,6 +2049,7 @@
       <w:pPr>
         <w:pStyle w:val="ReportCode"/>
         <w:jc w:val="left"/>
+        <w:shd w:fill="F2F2F2"/>
       </w:pPr>
       <w:r>
         <w:t xml:space="preserve">    'Dart',</w:t>
@@ -2028,6 +2059,7 @@
       <w:pPr>
         <w:pStyle w:val="ReportCode"/>
         <w:jc w:val="left"/>
+        <w:shd w:fill="F2F2F2"/>
       </w:pPr>
       <w:r>
         <w:t xml:space="preserve">    'Язык Flutter для мобильных и веб-приложений.',</w:t>
@@ -2037,6 +2069,7 @@
       <w:pPr>
         <w:pStyle w:val="ReportCode"/>
         <w:jc w:val="left"/>
+        <w:shd w:fill="F2F2F2"/>
       </w:pPr>
       <w:r>
         <w:t xml:space="preserve">    'assets/images/dart.png',</w:t>
@@ -2046,6 +2079,7 @@
       <w:pPr>
         <w:pStyle w:val="ReportCode"/>
         <w:jc w:val="left"/>
+        <w:shd w:fill="F2F2F2"/>
       </w:pPr>
       <w:r>
         <w:t xml:space="preserve">    Icons.phone_android,</w:t>
@@ -2055,6 +2089,7 @@
       <w:pPr>
         <w:pStyle w:val="ReportCode"/>
         <w:jc w:val="left"/>
+        <w:shd w:fill="F2F2F2"/>
       </w:pPr>
       <w:r>
         <w:t xml:space="preserve">  ),</w:t>
@@ -2064,6 +2099,7 @@
       <w:pPr>
         <w:pStyle w:val="ReportCode"/>
         <w:jc w:val="left"/>
+        <w:shd w:fill="F2F2F2"/>
       </w:pPr>
       <w:r>
         <w:t xml:space="preserve">  LanguageInfo(</w:t>
@@ -2073,6 +2109,7 @@
       <w:pPr>
         <w:pStyle w:val="ReportCode"/>
         <w:jc w:val="left"/>
+        <w:shd w:fill="F2F2F2"/>
       </w:pPr>
       <w:r>
         <w:t xml:space="preserve">    'Python',</w:t>
@@ -2082,6 +2119,7 @@
       <w:pPr>
         <w:pStyle w:val="ReportCode"/>
         <w:jc w:val="left"/>
+        <w:shd w:fill="F2F2F2"/>
       </w:pPr>
       <w:r>
         <w:t xml:space="preserve">    'Читаемый язык для автоматизации и анализа данных.',</w:t>
@@ -2091,6 +2129,7 @@
       <w:pPr>
         <w:pStyle w:val="ReportCode"/>
         <w:jc w:val="left"/>
+        <w:shd w:fill="F2F2F2"/>
       </w:pPr>
       <w:r>
         <w:t xml:space="preserve">    'assets/images/python.png',</w:t>
@@ -2100,6 +2139,7 @@
       <w:pPr>
         <w:pStyle w:val="ReportCode"/>
         <w:jc w:val="left"/>
+        <w:shd w:fill="F2F2F2"/>
       </w:pPr>
       <w:r>
         <w:t xml:space="preserve">    Icons.terminal,</w:t>
@@ -2109,6 +2149,7 @@
       <w:pPr>
         <w:pStyle w:val="ReportCode"/>
         <w:jc w:val="left"/>
+        <w:shd w:fill="F2F2F2"/>
       </w:pPr>
       <w:r>
         <w:t xml:space="preserve">  ),</w:t>
@@ -2118,6 +2159,7 @@
       <w:pPr>
         <w:pStyle w:val="ReportCode"/>
         <w:jc w:val="left"/>
+        <w:shd w:fill="F2F2F2"/>
       </w:pPr>
       <w:r>
         <w:t xml:space="preserve">  LanguageInfo(</w:t>
@@ -2127,6 +2169,7 @@
       <w:pPr>
         <w:pStyle w:val="ReportCode"/>
         <w:jc w:val="left"/>
+        <w:shd w:fill="F2F2F2"/>
       </w:pPr>
       <w:r>
         <w:t xml:space="preserve">    'Java',</w:t>
@@ -2136,6 +2179,7 @@
       <w:pPr>
         <w:pStyle w:val="ReportCode"/>
         <w:jc w:val="left"/>
+        <w:shd w:fill="F2F2F2"/>
       </w:pPr>
       <w:r>
         <w:t xml:space="preserve">    'Язык для серверных и корпоративных приложений.',</w:t>
@@ -2145,6 +2189,7 @@
       <w:pPr>
         <w:pStyle w:val="ReportCode"/>
         <w:jc w:val="left"/>
+        <w:shd w:fill="F2F2F2"/>
       </w:pPr>
       <w:r>
         <w:t xml:space="preserve">    'assets/images/java.png',</w:t>
@@ -2154,6 +2199,7 @@
       <w:pPr>
         <w:pStyle w:val="ReportCode"/>
         <w:jc w:val="left"/>
+        <w:shd w:fill="F2F2F2"/>
       </w:pPr>
       <w:r>
         <w:t xml:space="preserve">    Icons.dns_outlined,</w:t>
@@ -2163,6 +2209,7 @@
       <w:pPr>
         <w:pStyle w:val="ReportCode"/>
         <w:jc w:val="left"/>
+        <w:shd w:fill="F2F2F2"/>
       </w:pPr>
       <w:r>
         <w:t xml:space="preserve">  ),</w:t>
@@ -2172,6 +2219,7 @@
       <w:pPr>
         <w:pStyle w:val="ReportCode"/>
         <w:jc w:val="left"/>
+        <w:shd w:fill="F2F2F2"/>
       </w:pPr>
       <w:r>
         <w:t xml:space="preserve">  LanguageInfo(</w:t>
@@ -2181,6 +2229,7 @@
       <w:pPr>
         <w:pStyle w:val="ReportCode"/>
         <w:jc w:val="left"/>
+        <w:shd w:fill="F2F2F2"/>
       </w:pPr>
       <w:r>
         <w:t xml:space="preserve">    'C++',</w:t>
@@ -2190,6 +2239,7 @@
       <w:pPr>
         <w:pStyle w:val="ReportCode"/>
         <w:jc w:val="left"/>
+        <w:shd w:fill="F2F2F2"/>
       </w:pPr>
       <w:r>
         <w:t xml:space="preserve">    'Язык для системного и высокопроизводительного ПО.',</w:t>
@@ -2199,6 +2249,7 @@
       <w:pPr>
         <w:pStyle w:val="ReportCode"/>
         <w:jc w:val="left"/>
+        <w:shd w:fill="F2F2F2"/>
       </w:pPr>
       <w:r>
         <w:t xml:space="preserve">    'assets/images/cpp.png',</w:t>
@@ -2208,6 +2259,7 @@
       <w:pPr>
         <w:pStyle w:val="ReportCode"/>
         <w:jc w:val="left"/>
+        <w:shd w:fill="F2F2F2"/>
       </w:pPr>
       <w:r>
         <w:t xml:space="preserve">    Icons.memory_outlined,</w:t>
@@ -2217,6 +2269,7 @@
       <w:pPr>
         <w:pStyle w:val="ReportCode"/>
         <w:jc w:val="left"/>
+        <w:shd w:fill="F2F2F2"/>
       </w:pPr>
       <w:r>
         <w:t xml:space="preserve">  ),</w:t>
@@ -2226,6 +2279,7 @@
       <w:pPr>
         <w:pStyle w:val="ReportCode"/>
         <w:jc w:val="left"/>
+        <w:shd w:fill="F2F2F2"/>
       </w:pPr>
       <w:r>
         <w:t xml:space="preserve">  LanguageInfo(</w:t>
@@ -2235,6 +2289,7 @@
       <w:pPr>
         <w:pStyle w:val="ReportCode"/>
         <w:jc w:val="left"/>
+        <w:shd w:fill="F2F2F2"/>
       </w:pPr>
       <w:r>
         <w:t xml:space="preserve">    'JavaScript',</w:t>
@@ -2258,6 +2313,7 @@
       <w:pPr>
         <w:pStyle w:val="ReportCode"/>
         <w:jc w:val="left"/>
+        <w:shd w:fill="F2F2F2"/>
       </w:pPr>
       <w:r>
         <w:t xml:space="preserve">    'Язык интерактивных веб-страниц и приложений.',</w:t>
@@ -2267,6 +2323,7 @@
       <w:pPr>
         <w:pStyle w:val="ReportCode"/>
         <w:jc w:val="left"/>
+        <w:shd w:fill="F2F2F2"/>
       </w:pPr>
       <w:r>
         <w:t xml:space="preserve">    'assets/images/javascript.png',</w:t>
@@ -2276,6 +2333,7 @@
       <w:pPr>
         <w:pStyle w:val="ReportCode"/>
         <w:jc w:val="left"/>
+        <w:shd w:fill="F2F2F2"/>
       </w:pPr>
       <w:r>
         <w:t xml:space="preserve">    Icons.web_outlined,</w:t>
@@ -2285,6 +2343,7 @@
       <w:pPr>
         <w:pStyle w:val="ReportCode"/>
         <w:jc w:val="left"/>
+        <w:shd w:fill="F2F2F2"/>
       </w:pPr>
       <w:r>
         <w:t xml:space="preserve">  ),</w:t>
@@ -2294,6 +2353,7 @@
       <w:pPr>
         <w:pStyle w:val="ReportCode"/>
         <w:jc w:val="left"/>
+        <w:shd w:fill="F2F2F2"/>
       </w:pPr>
       <w:r>
         <w:t>];</w:t>
@@ -2303,12 +2363,14 @@
       <w:pPr>
         <w:pStyle w:val="ReportCode"/>
         <w:jc w:val="left"/>
-      </w:pPr>
-    </w:p>
-    <w:p>
-      <w:pPr>
-        <w:pStyle w:val="ReportCode"/>
-        <w:jc w:val="left"/>
+        <w:shd w:fill="F2F2F2"/>
+      </w:pPr>
+    </w:p>
+    <w:p>
+      <w:pPr>
+        <w:pStyle w:val="ReportCode"/>
+        <w:jc w:val="left"/>
+        <w:shd w:fill="F2F2F2"/>
       </w:pPr>
       <w:r>
         <w:t>class ProgrammingLanguagesApp extends StatelessWidget {</w:t>
@@ -2318,6 +2380,7 @@
       <w:pPr>
         <w:pStyle w:val="ReportCode"/>
         <w:jc w:val="left"/>
+        <w:shd w:fill="F2F2F2"/>
       </w:pPr>
       <w:r>
         <w:t xml:space="preserve">  const ProgrammingLanguagesApp({super.key});</w:t>
@@ -2327,12 +2390,14 @@
       <w:pPr>
         <w:pStyle w:val="ReportCode"/>
         <w:jc w:val="left"/>
-      </w:pPr>
-    </w:p>
-    <w:p>
-      <w:pPr>
-        <w:pStyle w:val="ReportCode"/>
-        <w:jc w:val="left"/>
+        <w:shd w:fill="F2F2F2"/>
+      </w:pPr>
+    </w:p>
+    <w:p>
+      <w:pPr>
+        <w:pStyle w:val="ReportCode"/>
+        <w:jc w:val="left"/>
+        <w:shd w:fill="F2F2F2"/>
       </w:pPr>
       <w:r>
         <w:t xml:space="preserve">  @override</w:t>
@@ -2342,6 +2407,7 @@
       <w:pPr>
         <w:pStyle w:val="ReportCode"/>
         <w:jc w:val="left"/>
+        <w:shd w:fill="F2F2F2"/>
       </w:pPr>
       <w:r>
         <w:t xml:space="preserve">  Widget build(BuildContext context) {</w:t>
@@ -2351,6 +2417,7 @@
       <w:pPr>
         <w:pStyle w:val="ReportCode"/>
         <w:jc w:val="left"/>
+        <w:shd w:fill="F2F2F2"/>
       </w:pPr>
       <w:r>
         <w:t xml:space="preserve">    return MaterialApp(</w:t>
@@ -2360,6 +2427,7 @@
       <w:pPr>
         <w:pStyle w:val="ReportCode"/>
         <w:jc w:val="left"/>
+        <w:shd w:fill="F2F2F2"/>
       </w:pPr>
       <w:r>
         <w:t xml:space="preserve">      title: 'Практическая работа 4',</w:t>
@@ -2369,6 +2437,7 @@
       <w:pPr>
         <w:pStyle w:val="ReportCode"/>
         <w:jc w:val="left"/>
+        <w:shd w:fill="F2F2F2"/>
       </w:pPr>
       <w:r>
         <w:t xml:space="preserve">      debugShowCheckedModeBanner: false,</w:t>
@@ -2378,6 +2447,7 @@
       <w:pPr>
         <w:pStyle w:val="ReportCode"/>
         <w:jc w:val="left"/>
+        <w:shd w:fill="F2F2F2"/>
       </w:pPr>
       <w:r>
         <w:t xml:space="preserve">      theme: ThemeData(</w:t>
@@ -2387,6 +2457,7 @@
       <w:pPr>
         <w:pStyle w:val="ReportCode"/>
         <w:jc w:val="left"/>
+        <w:shd w:fill="F2F2F2"/>
       </w:pPr>
       <w:r>
         <w:t xml:space="preserve">        colorSchemeSeed: Colors.green,</w:t>
@@ -2396,6 +2467,7 @@
       <w:pPr>
         <w:pStyle w:val="ReportCode"/>
         <w:jc w:val="left"/>
+        <w:shd w:fill="F2F2F2"/>
       </w:pPr>
       <w:r>
         <w:t xml:space="preserve">        useMaterial3: true,</w:t>
@@ -2405,6 +2477,7 @@
       <w:pPr>
         <w:pStyle w:val="ReportCode"/>
         <w:jc w:val="left"/>
+        <w:shd w:fill="F2F2F2"/>
       </w:pPr>
       <w:r>
         <w:t xml:space="preserve">        scaffoldBackgroundColor: Colors.white,</w:t>
@@ -2414,6 +2487,7 @@
       <w:pPr>
         <w:pStyle w:val="ReportCode"/>
         <w:jc w:val="left"/>
+        <w:shd w:fill="F2F2F2"/>
       </w:pPr>
       <w:r>
         <w:t xml:space="preserve">      ),</w:t>
@@ -2423,6 +2497,7 @@
       <w:pPr>
         <w:pStyle w:val="ReportCode"/>
         <w:jc w:val="left"/>
+        <w:shd w:fill="F2F2F2"/>
       </w:pPr>
       <w:r>
         <w:t xml:space="preserve">      home: const LanguagesPage(),</w:t>
@@ -2432,6 +2507,7 @@
       <w:pPr>
         <w:pStyle w:val="ReportCode"/>
         <w:jc w:val="left"/>
+        <w:shd w:fill="F2F2F2"/>
       </w:pPr>
       <w:r>
         <w:t xml:space="preserve">    );</w:t>
@@ -2441,6 +2517,7 @@
       <w:pPr>
         <w:pStyle w:val="ReportCode"/>
         <w:jc w:val="left"/>
+        <w:shd w:fill="F2F2F2"/>
       </w:pPr>
       <w:r>
         <w:t xml:space="preserve">  }</w:t>
@@ -2450,6 +2527,7 @@
       <w:pPr>
         <w:pStyle w:val="ReportCode"/>
         <w:jc w:val="left"/>
+        <w:shd w:fill="F2F2F2"/>
       </w:pPr>
       <w:r>
         <w:t>}</w:t>
@@ -2459,13 +2537,15 @@
       <w:pPr>
         <w:pStyle w:val="ReportCode"/>
         <w:jc w:val="left"/>
-      </w:pPr>
-    </w:p>
-    <w:p>
-      <w:pPr>
-        <w:pStyle w:val="ReportCode"/>
+        <w:shd w:fill="F2F2F2"/>
+      </w:pPr>
+    </w:p>
+    <w:p>
+      <w:pPr>
+        <w:pStyle w:val="ReportCode"/>
+        <w:jc w:val="left"/>
         <w:keepNext/>
-        <w:jc w:val="left"/>
+        <w:shd w:fill="F2F2F2"/>
       </w:pPr>
       <w:r>
         <w:t>// Состояние хранит выбранную карточку, чтобы подсветить её после нажатия.</w:t>
@@ -2475,6 +2555,7 @@
       <w:pPr>
         <w:pStyle w:val="ReportCode"/>
         <w:jc w:val="left"/>
+        <w:shd w:fill="F2F2F2"/>
       </w:pPr>
       <w:r>
         <w:t>class LanguagesPage extends StatefulWidget {</w:t>
@@ -2484,6 +2565,7 @@
       <w:pPr>
         <w:pStyle w:val="ReportCode"/>
         <w:jc w:val="left"/>
+        <w:shd w:fill="F2F2F2"/>
       </w:pPr>
       <w:r>
         <w:t xml:space="preserve">  const LanguagesPage({super.key});</w:t>
@@ -2493,12 +2575,14 @@
       <w:pPr>
         <w:pStyle w:val="ReportCode"/>
         <w:jc w:val="left"/>
-      </w:pPr>
-    </w:p>
-    <w:p>
-      <w:pPr>
-        <w:pStyle w:val="ReportCode"/>
-        <w:jc w:val="left"/>
+        <w:shd w:fill="F2F2F2"/>
+      </w:pPr>
+    </w:p>
+    <w:p>
+      <w:pPr>
+        <w:pStyle w:val="ReportCode"/>
+        <w:jc w:val="left"/>
+        <w:shd w:fill="F2F2F2"/>
       </w:pPr>
       <w:r>
         <w:t xml:space="preserve">  @override</w:t>
@@ -2508,6 +2592,7 @@
       <w:pPr>
         <w:pStyle w:val="ReportCode"/>
         <w:jc w:val="left"/>
+        <w:shd w:fill="F2F2F2"/>
       </w:pPr>
       <w:r>
         <w:t xml:space="preserve">  State&lt;LanguagesPage&gt; createState() =&gt; _LanguagesPageState();</w:t>
@@ -2517,6 +2602,7 @@
       <w:pPr>
         <w:pStyle w:val="ReportCode"/>
         <w:jc w:val="left"/>
+        <w:shd w:fill="F2F2F2"/>
       </w:pPr>
       <w:r>
         <w:t>}</w:t>
@@ -2526,12 +2612,14 @@
       <w:pPr>
         <w:pStyle w:val="ReportCode"/>
         <w:jc w:val="left"/>
-      </w:pPr>
-    </w:p>
-    <w:p>
-      <w:pPr>
-        <w:pStyle w:val="ReportCode"/>
-        <w:jc w:val="left"/>
+        <w:shd w:fill="F2F2F2"/>
+      </w:pPr>
+    </w:p>
+    <w:p>
+      <w:pPr>
+        <w:pStyle w:val="ReportCode"/>
+        <w:jc w:val="left"/>
+        <w:shd w:fill="F2F2F2"/>
       </w:pPr>
       <w:r>
         <w:t>class _LanguagesPageState extends State&lt;LanguagesPage&gt; {</w:t>
@@ -2541,6 +2629,7 @@
       <w:pPr>
         <w:pStyle w:val="ReportCode"/>
         <w:jc w:val="left"/>
+        <w:shd w:fill="F2F2F2"/>
       </w:pPr>
       <w:r>
         <w:t xml:space="preserve">  int? _selectedIndex;</w:t>
@@ -2550,12 +2639,14 @@
       <w:pPr>
         <w:pStyle w:val="ReportCode"/>
         <w:jc w:val="left"/>
-      </w:pPr>
-    </w:p>
-    <w:p>
-      <w:pPr>
-        <w:pStyle w:val="ReportCode"/>
-        <w:jc w:val="left"/>
+        <w:shd w:fill="F2F2F2"/>
+      </w:pPr>
+    </w:p>
+    <w:p>
+      <w:pPr>
+        <w:pStyle w:val="ReportCode"/>
+        <w:jc w:val="left"/>
+        <w:shd w:fill="F2F2F2"/>
       </w:pPr>
       <w:r>
         <w:t xml:space="preserve">  void _selectLanguage(int index) {</w:t>
@@ -2565,6 +2656,7 @@
       <w:pPr>
         <w:pStyle w:val="ReportCode"/>
         <w:jc w:val="left"/>
+        <w:shd w:fill="F2F2F2"/>
       </w:pPr>
       <w:r>
         <w:t xml:space="preserve">    setState(() =&gt; _selectedIndex = index);</w:t>
@@ -2574,13 +2666,15 @@
       <w:pPr>
         <w:pStyle w:val="ReportCode"/>
         <w:jc w:val="left"/>
-      </w:pPr>
-    </w:p>
-    <w:p>
-      <w:pPr>
-        <w:pStyle w:val="ReportCode"/>
+        <w:shd w:fill="F2F2F2"/>
+      </w:pPr>
+    </w:p>
+    <w:p>
+      <w:pPr>
+        <w:pStyle w:val="ReportCode"/>
+        <w:jc w:val="left"/>
         <w:keepNext/>
-        <w:jc w:val="left"/>
+        <w:shd w:fill="F2F2F2"/>
       </w:pPr>
       <w:r>
         <w:t xml:space="preserve">    // ScaffoldMessenger показывает уведомление поверх текущего Scaffold.</w:t>
@@ -2590,6 +2684,7 @@
       <w:pPr>
         <w:pStyle w:val="ReportCode"/>
         <w:jc w:val="left"/>
+        <w:shd w:fill="F2F2F2"/>
       </w:pPr>
       <w:r>
         <w:t xml:space="preserve">    final messenger = ScaffoldMessenger.of(context);</w:t>
@@ -2599,6 +2694,7 @@
       <w:pPr>
         <w:pStyle w:val="ReportCode"/>
         <w:jc w:val="left"/>
+        <w:shd w:fill="F2F2F2"/>
       </w:pPr>
       <w:r>
         <w:t xml:space="preserve">    messenger.removeCurrentSnackBar();</w:t>
@@ -2608,6 +2704,7 @@
       <w:pPr>
         <w:pStyle w:val="ReportCode"/>
         <w:jc w:val="left"/>
+        <w:shd w:fill="F2F2F2"/>
       </w:pPr>
       <w:r>
         <w:t xml:space="preserve">    messenger.showSnackBar(</w:t>
@@ -2617,6 +2714,7 @@
       <w:pPr>
         <w:pStyle w:val="ReportCode"/>
         <w:jc w:val="left"/>
+        <w:shd w:fill="F2F2F2"/>
       </w:pPr>
       <w:r>
         <w:t xml:space="preserve">      SnackBar(</w:t>
@@ -2626,6 +2724,7 @@
       <w:pPr>
         <w:pStyle w:val="ReportCode"/>
         <w:jc w:val="left"/>
+        <w:shd w:fill="F2F2F2"/>
       </w:pPr>
       <w:r>
         <w:t xml:space="preserve">        content: Text('Выбран язык: ${languages[index].name}'),</w:t>
@@ -2635,6 +2734,7 @@
       <w:pPr>
         <w:pStyle w:val="ReportCode"/>
         <w:jc w:val="left"/>
+        <w:shd w:fill="F2F2F2"/>
       </w:pPr>
       <w:r>
         <w:t xml:space="preserve">        duration: const Duration(seconds: 3),</w:t>
@@ -2644,6 +2744,7 @@
       <w:pPr>
         <w:pStyle w:val="ReportCode"/>
         <w:jc w:val="left"/>
+        <w:shd w:fill="F2F2F2"/>
       </w:pPr>
       <w:r>
         <w:t xml:space="preserve">      ),</w:t>
@@ -2653,6 +2754,7 @@
       <w:pPr>
         <w:pStyle w:val="ReportCode"/>
         <w:jc w:val="left"/>
+        <w:shd w:fill="F2F2F2"/>
       </w:pPr>
       <w:r>
         <w:t xml:space="preserve">    );</w:t>
@@ -2662,6 +2764,7 @@
       <w:pPr>
         <w:pStyle w:val="ReportCode"/>
         <w:jc w:val="left"/>
+        <w:shd w:fill="F2F2F2"/>
       </w:pPr>
       <w:r>
         <w:t xml:space="preserve">  }</w:t>
@@ -2671,6 +2774,7 @@
       <w:pPr>
         <w:pStyle w:val="ReportCode"/>
         <w:jc w:val="left"/>
+        <w:shd w:fill="F2F2F2"/>
       </w:pPr>
     </w:p>
     <w:p>
@@ -2691,6 +2795,7 @@
       <w:pPr>
         <w:pStyle w:val="ReportCode"/>
         <w:jc w:val="left"/>
+        <w:shd w:fill="F2F2F2"/>
       </w:pPr>
       <w:r>
         <w:t xml:space="preserve">  @override</w:t>
@@ -2700,6 +2805,7 @@
       <w:pPr>
         <w:pStyle w:val="ReportCode"/>
         <w:jc w:val="left"/>
+        <w:shd w:fill="F2F2F2"/>
       </w:pPr>
       <w:r>
         <w:t xml:space="preserve">  Widget build(BuildContext context) {</w:t>
@@ -2709,6 +2815,7 @@
       <w:pPr>
         <w:pStyle w:val="ReportCode"/>
         <w:jc w:val="left"/>
+        <w:shd w:fill="F2F2F2"/>
       </w:pPr>
       <w:r>
         <w:t xml:space="preserve">    return Scaffold(</w:t>
@@ -2718,6 +2825,7 @@
       <w:pPr>
         <w:pStyle w:val="ReportCode"/>
         <w:jc w:val="left"/>
+        <w:shd w:fill="F2F2F2"/>
       </w:pPr>
       <w:r>
         <w:t xml:space="preserve">      appBar: AppBar(</w:t>
@@ -2727,6 +2835,7 @@
       <w:pPr>
         <w:pStyle w:val="ReportCode"/>
         <w:jc w:val="left"/>
+        <w:shd w:fill="F2F2F2"/>
       </w:pPr>
       <w:r>
         <w:t xml:space="preserve">        title: const Text('Практическая работа 4'),</w:t>
@@ -2736,6 +2845,7 @@
       <w:pPr>
         <w:pStyle w:val="ReportCode"/>
         <w:jc w:val="left"/>
+        <w:shd w:fill="F2F2F2"/>
       </w:pPr>
       <w:r>
         <w:t xml:space="preserve">        backgroundColor: Colors.lightGreenAccent,</w:t>
@@ -2745,6 +2855,7 @@
       <w:pPr>
         <w:pStyle w:val="ReportCode"/>
         <w:jc w:val="left"/>
+        <w:shd w:fill="F2F2F2"/>
       </w:pPr>
       <w:r>
         <w:t xml:space="preserve">        centerTitle: true,</w:t>
@@ -2754,6 +2865,7 @@
       <w:pPr>
         <w:pStyle w:val="ReportCode"/>
         <w:jc w:val="left"/>
+        <w:shd w:fill="F2F2F2"/>
       </w:pPr>
       <w:r>
         <w:t xml:space="preserve">      ),</w:t>
@@ -2763,6 +2875,7 @@
       <w:pPr>
         <w:pStyle w:val="ReportCode"/>
         <w:jc w:val="left"/>
+        <w:shd w:fill="F2F2F2"/>
       </w:pPr>
       <w:r>
         <w:t xml:space="preserve">      body: SafeArea(</w:t>
@@ -2771,8 +2884,9 @@
     <w:p>
       <w:pPr>
         <w:pStyle w:val="ReportCode"/>
+        <w:jc w:val="left"/>
         <w:keepNext/>
-        <w:jc w:val="left"/>
+        <w:shd w:fill="F2F2F2"/>
       </w:pPr>
       <w:r>
         <w:t xml:space="preserve">        // Короткий экран получает компактную галерею и описание.</w:t>
@@ -2782,6 +2896,7 @@
       <w:pPr>
         <w:pStyle w:val="ReportCode"/>
         <w:jc w:val="left"/>
+        <w:shd w:fill="F2F2F2"/>
       </w:pPr>
       <w:r>
         <w:t xml:space="preserve">        child: LayoutBuilder(</w:t>
@@ -2791,6 +2906,7 @@
       <w:pPr>
         <w:pStyle w:val="ReportCode"/>
         <w:jc w:val="left"/>
+        <w:shd w:fill="F2F2F2"/>
       </w:pPr>
       <w:r>
         <w:t xml:space="preserve">          builder: (context, constraints) {</w:t>
@@ -2800,6 +2916,7 @@
       <w:pPr>
         <w:pStyle w:val="ReportCode"/>
         <w:jc w:val="left"/>
+        <w:shd w:fill="F2F2F2"/>
       </w:pPr>
       <w:r>
         <w:t xml:space="preserve">            final compact = constraints.maxHeight &lt; 600;</w:t>
@@ -2809,6 +2926,7 @@
       <w:pPr>
         <w:pStyle w:val="ReportCode"/>
         <w:jc w:val="left"/>
+        <w:shd w:fill="F2F2F2"/>
       </w:pPr>
       <w:r>
         <w:t xml:space="preserve">            final galleryHeight = compact ? 126.0 : 184.0;</w:t>
@@ -2818,6 +2936,7 @@
       <w:pPr>
         <w:pStyle w:val="ReportCode"/>
         <w:jc w:val="left"/>
+        <w:shd w:fill="F2F2F2"/>
       </w:pPr>
       <w:r>
         <w:t xml:space="preserve">            final galleryWidth = compact ? 166.0 : 190.0;</w:t>
@@ -2827,12 +2946,14 @@
       <w:pPr>
         <w:pStyle w:val="ReportCode"/>
         <w:jc w:val="left"/>
-      </w:pPr>
-    </w:p>
-    <w:p>
-      <w:pPr>
-        <w:pStyle w:val="ReportCode"/>
-        <w:jc w:val="left"/>
+        <w:shd w:fill="F2F2F2"/>
+      </w:pPr>
+    </w:p>
+    <w:p>
+      <w:pPr>
+        <w:pStyle w:val="ReportCode"/>
+        <w:jc w:val="left"/>
+        <w:shd w:fill="F2F2F2"/>
       </w:pPr>
       <w:r>
         <w:t xml:space="preserve">            return Padding(</w:t>
@@ -2842,6 +2963,7 @@
       <w:pPr>
         <w:pStyle w:val="ReportCode"/>
         <w:jc w:val="left"/>
+        <w:shd w:fill="F2F2F2"/>
       </w:pPr>
       <w:r>
         <w:t xml:space="preserve">              padding: const EdgeInsets.fromLTRB(16, 12, 16, 8),</w:t>
@@ -2851,6 +2973,7 @@
       <w:pPr>
         <w:pStyle w:val="ReportCode"/>
         <w:jc w:val="left"/>
+        <w:shd w:fill="F2F2F2"/>
       </w:pPr>
       <w:r>
         <w:t xml:space="preserve">              child: Column(</w:t>
@@ -2860,6 +2983,7 @@
       <w:pPr>
         <w:pStyle w:val="ReportCode"/>
         <w:jc w:val="left"/>
+        <w:shd w:fill="F2F2F2"/>
       </w:pPr>
       <w:r>
         <w:t xml:space="preserve">                crossAxisAlignment: CrossAxisAlignment.stretch,</w:t>
@@ -2869,6 +2993,7 @@
       <w:pPr>
         <w:pStyle w:val="ReportCode"/>
         <w:jc w:val="left"/>
+        <w:shd w:fill="F2F2F2"/>
       </w:pPr>
       <w:r>
         <w:t xml:space="preserve">                children: [</w:t>
@@ -2878,6 +3003,7 @@
       <w:pPr>
         <w:pStyle w:val="ReportCode"/>
         <w:jc w:val="left"/>
+        <w:shd w:fill="F2F2F2"/>
       </w:pPr>
       <w:r>
         <w:t xml:space="preserve">                  Text(</w:t>
@@ -2887,6 +3013,7 @@
       <w:pPr>
         <w:pStyle w:val="ReportCode"/>
         <w:jc w:val="left"/>
+        <w:shd w:fill="F2F2F2"/>
       </w:pPr>
       <w:r>
         <w:t xml:space="preserve">                    'Языки программирования',</w:t>
@@ -2896,6 +3023,7 @@
       <w:pPr>
         <w:pStyle w:val="ReportCode"/>
         <w:jc w:val="left"/>
+        <w:shd w:fill="F2F2F2"/>
       </w:pPr>
       <w:r>
         <w:t xml:space="preserve">                    textAlign: TextAlign.center,</w:t>
@@ -2905,6 +3033,7 @@
       <w:pPr>
         <w:pStyle w:val="ReportCode"/>
         <w:jc w:val="left"/>
+        <w:shd w:fill="F2F2F2"/>
       </w:pPr>
       <w:r>
         <w:t xml:space="preserve">                    style: TextStyle(</w:t>
@@ -2914,6 +3043,7 @@
       <w:pPr>
         <w:pStyle w:val="ReportCode"/>
         <w:jc w:val="left"/>
+        <w:shd w:fill="F2F2F2"/>
       </w:pPr>
       <w:r>
         <w:t xml:space="preserve">                      fontFamily: 'NotoSansCustom',</w:t>
@@ -2923,6 +3053,7 @@
       <w:pPr>
         <w:pStyle w:val="ReportCode"/>
         <w:jc w:val="left"/>
+        <w:shd w:fill="F2F2F2"/>
       </w:pPr>
       <w:r>
         <w:t xml:space="preserve">                      fontSize: compact ? 19 : 22,</w:t>
@@ -2932,6 +3063,7 @@
       <w:pPr>
         <w:pStyle w:val="ReportCode"/>
         <w:jc w:val="left"/>
+        <w:shd w:fill="F2F2F2"/>
       </w:pPr>
       <w:r>
         <w:t xml:space="preserve">                      fontWeight: FontWeight.bold,</w:t>
@@ -2941,6 +3073,7 @@
       <w:pPr>
         <w:pStyle w:val="ReportCode"/>
         <w:jc w:val="left"/>
+        <w:shd w:fill="F2F2F2"/>
       </w:pPr>
       <w:r>
         <w:t xml:space="preserve">                    ),</w:t>
@@ -2950,6 +3083,7 @@
       <w:pPr>
         <w:pStyle w:val="ReportCode"/>
         <w:jc w:val="left"/>
+        <w:shd w:fill="F2F2F2"/>
       </w:pPr>
       <w:r>
         <w:t xml:space="preserve">                  ),</w:t>
@@ -2959,6 +3093,7 @@
       <w:pPr>
         <w:pStyle w:val="ReportCode"/>
         <w:jc w:val="left"/>
+        <w:shd w:fill="F2F2F2"/>
       </w:pPr>
       <w:r>
         <w:t xml:space="preserve">                  const SizedBox(height: 7),</w:t>
@@ -2968,6 +3103,7 @@
       <w:pPr>
         <w:pStyle w:val="ReportCode"/>
         <w:jc w:val="left"/>
+        <w:shd w:fill="F2F2F2"/>
       </w:pPr>
       <w:r>
         <w:t xml:space="preserve">                  Text(</w:t>
@@ -2977,6 +3113,7 @@
       <w:pPr>
         <w:pStyle w:val="ReportCode"/>
         <w:jc w:val="left"/>
+        <w:shd w:fill="F2F2F2"/>
       </w:pPr>
       <w:r>
         <w:t xml:space="preserve">                    compact</w:t>
@@ -2986,6 +3123,7 @@
       <w:pPr>
         <w:pStyle w:val="ReportCode"/>
         <w:jc w:val="left"/>
+        <w:shd w:fill="F2F2F2"/>
       </w:pPr>
       <w:r>
         <w:t xml:space="preserve">                        ? 'Пять языков: галерея и список с описаниями.'</w:t>
@@ -2995,6 +3133,7 @@
       <w:pPr>
         <w:pStyle w:val="ReportCode"/>
         <w:jc w:val="left"/>
+        <w:shd w:fill="F2F2F2"/>
       </w:pPr>
       <w:r>
         <w:t xml:space="preserve">                        : 'Языки программирования помогают создавать приложения, '</w:t>
@@ -3004,6 +3143,7 @@
       <w:pPr>
         <w:pStyle w:val="ReportCode"/>
         <w:jc w:val="left"/>
+        <w:shd w:fill="F2F2F2"/>
       </w:pPr>
       <w:r>
         <w:t xml:space="preserve">                              'сайты и системы. Ниже — галерея и список с описаниями.',</w:t>
@@ -3013,6 +3153,7 @@
       <w:pPr>
         <w:pStyle w:val="ReportCode"/>
         <w:jc w:val="left"/>
+        <w:shd w:fill="F2F2F2"/>
       </w:pPr>
       <w:r>
         <w:t xml:space="preserve">                    maxLines: compact ? 2 : 3,</w:t>
@@ -3022,6 +3163,7 @@
       <w:pPr>
         <w:pStyle w:val="ReportCode"/>
         <w:jc w:val="left"/>
+        <w:shd w:fill="F2F2F2"/>
       </w:pPr>
       <w:r>
         <w:t xml:space="preserve">                    overflow: TextOverflow.ellipsis,</w:t>
@@ -3031,6 +3173,7 @@
       <w:pPr>
         <w:pStyle w:val="ReportCode"/>
         <w:jc w:val="left"/>
+        <w:shd w:fill="F2F2F2"/>
       </w:pPr>
       <w:r>
         <w:t xml:space="preserve">                    style: TextStyle(fontSize: compact ? 13 : 15, height: 1.3),</w:t>
@@ -3040,6 +3183,7 @@
       <w:pPr>
         <w:pStyle w:val="ReportCode"/>
         <w:jc w:val="left"/>
+        <w:shd w:fill="F2F2F2"/>
       </w:pPr>
       <w:r>
         <w:t xml:space="preserve">                  ),</w:t>
@@ -3049,6 +3193,7 @@
       <w:pPr>
         <w:pStyle w:val="ReportCode"/>
         <w:jc w:val="left"/>
+        <w:shd w:fill="F2F2F2"/>
       </w:pPr>
       <w:r>
         <w:t xml:space="preserve">                  const SizedBox(height: 12),</w:t>
@@ -3058,6 +3203,7 @@
       <w:pPr>
         <w:pStyle w:val="ReportCode"/>
         <w:jc w:val="left"/>
+        <w:shd w:fill="F2F2F2"/>
       </w:pPr>
       <w:r>
         <w:t xml:space="preserve">                  const Text(</w:t>
@@ -3067,6 +3213,7 @@
       <w:pPr>
         <w:pStyle w:val="ReportCode"/>
         <w:jc w:val="left"/>
+        <w:shd w:fill="F2F2F2"/>
       </w:pPr>
       <w:r>
         <w:t xml:space="preserve">                    'Галерея языков',</w:t>
@@ -3076,6 +3223,7 @@
       <w:pPr>
         <w:pStyle w:val="ReportCode"/>
         <w:jc w:val="left"/>
+        <w:shd w:fill="F2F2F2"/>
       </w:pPr>
       <w:r>
         <w:t xml:space="preserve">                    style: TextStyle(fontSize: 16, fontWeight: FontWeight.bold),</w:t>
@@ -3085,6 +3233,7 @@
       <w:pPr>
         <w:pStyle w:val="ReportCode"/>
         <w:jc w:val="left"/>
+        <w:shd w:fill="F2F2F2"/>
       </w:pPr>
       <w:r>
         <w:t xml:space="preserve">                  ),</w:t>
@@ -3094,6 +3243,7 @@
       <w:pPr>
         <w:pStyle w:val="ReportCode"/>
         <w:jc w:val="left"/>
+        <w:shd w:fill="F2F2F2"/>
       </w:pPr>
       <w:r>
         <w:t xml:space="preserve">                  const SizedBox(height: 6),</w:t>
@@ -3103,6 +3253,7 @@
       <w:pPr>
         <w:pStyle w:val="ReportCode"/>
         <w:jc w:val="left"/>
+        <w:shd w:fill="F2F2F2"/>
       </w:pPr>
       <w:r>
         <w:t xml:space="preserve">                  SizedBox(</w:t>
@@ -3112,6 +3263,7 @@
       <w:pPr>
         <w:pStyle w:val="ReportCode"/>
         <w:jc w:val="left"/>
+        <w:shd w:fill="F2F2F2"/>
       </w:pPr>
       <w:r>
         <w:t xml:space="preserve">                    height: galleryHeight,</w:t>
@@ -3120,8 +3272,9 @@
     <w:p>
       <w:pPr>
         <w:pStyle w:val="ReportCode"/>
+        <w:jc w:val="left"/>
         <w:keepNext/>
-        <w:jc w:val="left"/>
+        <w:shd w:fill="F2F2F2"/>
       </w:pPr>
       <w:r>
         <w:t xml:space="preserve">                    // Горизонтальный список строит элементы по их индексам.</w:t>
@@ -3131,6 +3284,7 @@
       <w:pPr>
         <w:pStyle w:val="ReportCode"/>
         <w:jc w:val="left"/>
+        <w:shd w:fill="F2F2F2"/>
       </w:pPr>
       <w:r>
         <w:t xml:space="preserve">                    child: ListView.builder(</w:t>
@@ -3140,6 +3294,7 @@
       <w:pPr>
         <w:pStyle w:val="ReportCode"/>
         <w:jc w:val="left"/>
+        <w:shd w:fill="F2F2F2"/>
       </w:pPr>
       <w:r>
         <w:t xml:space="preserve">                      key: const Key('gallery'),</w:t>
@@ -3149,6 +3304,7 @@
       <w:pPr>
         <w:pStyle w:val="ReportCode"/>
         <w:jc w:val="left"/>
+        <w:shd w:fill="F2F2F2"/>
       </w:pPr>
       <w:r>
         <w:t xml:space="preserve">                      scrollDirection: Axis.horizontal,</w:t>
@@ -3172,6 +3328,7 @@
       <w:pPr>
         <w:pStyle w:val="ReportCode"/>
         <w:jc w:val="left"/>
+        <w:shd w:fill="F2F2F2"/>
       </w:pPr>
       <w:r>
         <w:t xml:space="preserve">                      itemCount: languages.length,</w:t>
@@ -3181,6 +3338,7 @@
       <w:pPr>
         <w:pStyle w:val="ReportCode"/>
         <w:jc w:val="left"/>
+        <w:shd w:fill="F2F2F2"/>
       </w:pPr>
       <w:r>
         <w:t xml:space="preserve">                      itemBuilder: (context, index) {</w:t>
@@ -3190,6 +3348,7 @@
       <w:pPr>
         <w:pStyle w:val="ReportCode"/>
         <w:jc w:val="left"/>
+        <w:shd w:fill="F2F2F2"/>
       </w:pPr>
       <w:r>
         <w:t xml:space="preserve">                        final language = languages[index];</w:t>
@@ -3199,6 +3358,7 @@
       <w:pPr>
         <w:pStyle w:val="ReportCode"/>
         <w:jc w:val="left"/>
+        <w:shd w:fill="F2F2F2"/>
       </w:pPr>
       <w:r>
         <w:t xml:space="preserve">                        return SizedBox(</w:t>
@@ -3208,6 +3368,7 @@
       <w:pPr>
         <w:pStyle w:val="ReportCode"/>
         <w:jc w:val="left"/>
+        <w:shd w:fill="F2F2F2"/>
       </w:pPr>
       <w:r>
         <w:t xml:space="preserve">                          key: Key('gallery-item-$index'),</w:t>
@@ -3217,6 +3378,7 @@
       <w:pPr>
         <w:pStyle w:val="ReportCode"/>
         <w:jc w:val="left"/>
+        <w:shd w:fill="F2F2F2"/>
       </w:pPr>
       <w:r>
         <w:t xml:space="preserve">                          width: galleryWidth,</w:t>
@@ -3226,6 +3388,7 @@
       <w:pPr>
         <w:pStyle w:val="ReportCode"/>
         <w:jc w:val="left"/>
+        <w:shd w:fill="F2F2F2"/>
       </w:pPr>
       <w:r>
         <w:t xml:space="preserve">                          child: Card(</w:t>
@@ -3235,6 +3398,7 @@
       <w:pPr>
         <w:pStyle w:val="ReportCode"/>
         <w:jc w:val="left"/>
+        <w:shd w:fill="F2F2F2"/>
       </w:pPr>
       <w:r>
         <w:t xml:space="preserve">                            margin: const EdgeInsets.only(right: 10, bottom: 4),</w:t>
@@ -3244,6 +3408,7 @@
       <w:pPr>
         <w:pStyle w:val="ReportCode"/>
         <w:jc w:val="left"/>
+        <w:shd w:fill="F2F2F2"/>
       </w:pPr>
       <w:r>
         <w:t xml:space="preserve">                            child: Padding(</w:t>
@@ -3253,6 +3418,7 @@
       <w:pPr>
         <w:pStyle w:val="ReportCode"/>
         <w:jc w:val="left"/>
+        <w:shd w:fill="F2F2F2"/>
       </w:pPr>
       <w:r>
         <w:t xml:space="preserve">                              padding: const EdgeInsets.all(8),</w:t>
@@ -3262,6 +3428,7 @@
       <w:pPr>
         <w:pStyle w:val="ReportCode"/>
         <w:jc w:val="left"/>
+        <w:shd w:fill="F2F2F2"/>
       </w:pPr>
       <w:r>
         <w:t xml:space="preserve">                              child: Column(</w:t>
@@ -3271,6 +3438,7 @@
       <w:pPr>
         <w:pStyle w:val="ReportCode"/>
         <w:jc w:val="left"/>
+        <w:shd w:fill="F2F2F2"/>
       </w:pPr>
       <w:r>
         <w:t xml:space="preserve">                                children: [</w:t>
@@ -3280,6 +3448,7 @@
       <w:pPr>
         <w:pStyle w:val="ReportCode"/>
         <w:jc w:val="left"/>
+        <w:shd w:fill="F2F2F2"/>
       </w:pPr>
       <w:r>
         <w:t xml:space="preserve">                                  Expanded(</w:t>
@@ -3288,8 +3457,9 @@
     <w:p>
       <w:pPr>
         <w:pStyle w:val="ReportCode"/>
+        <w:jc w:val="left"/>
         <w:keepNext/>
-        <w:jc w:val="left"/>
+        <w:shd w:fill="F2F2F2"/>
       </w:pPr>
       <w:r>
         <w:t xml:space="preserve">                                    // ClipRRect действительно обрезает углы картинки.</w:t>
@@ -3299,6 +3469,7 @@
       <w:pPr>
         <w:pStyle w:val="ReportCode"/>
         <w:jc w:val="left"/>
+        <w:shd w:fill="F2F2F2"/>
       </w:pPr>
       <w:r>
         <w:t xml:space="preserve">                                    child: ClipRRect(</w:t>
@@ -3308,6 +3479,7 @@
       <w:pPr>
         <w:pStyle w:val="ReportCode"/>
         <w:jc w:val="left"/>
+        <w:shd w:fill="F2F2F2"/>
       </w:pPr>
       <w:r>
         <w:t xml:space="preserve">                                      borderRadius: BorderRadius.circular(14),</w:t>
@@ -3317,6 +3489,7 @@
       <w:pPr>
         <w:pStyle w:val="ReportCode"/>
         <w:jc w:val="left"/>
+        <w:shd w:fill="F2F2F2"/>
       </w:pPr>
       <w:r>
         <w:t xml:space="preserve">                                      child: Image.asset(</w:t>
@@ -3326,6 +3499,7 @@
       <w:pPr>
         <w:pStyle w:val="ReportCode"/>
         <w:jc w:val="left"/>
+        <w:shd w:fill="F2F2F2"/>
       </w:pPr>
       <w:r>
         <w:t xml:space="preserve">                                        language.image,</w:t>
@@ -3335,6 +3509,7 @@
       <w:pPr>
         <w:pStyle w:val="ReportCode"/>
         <w:jc w:val="left"/>
+        <w:shd w:fill="F2F2F2"/>
       </w:pPr>
       <w:r>
         <w:t xml:space="preserve">                                        width: double.infinity,</w:t>
@@ -3344,6 +3519,7 @@
       <w:pPr>
         <w:pStyle w:val="ReportCode"/>
         <w:jc w:val="left"/>
+        <w:shd w:fill="F2F2F2"/>
       </w:pPr>
       <w:r>
         <w:t xml:space="preserve">                                        fit: BoxFit.contain,</w:t>
@@ -3353,6 +3529,7 @@
       <w:pPr>
         <w:pStyle w:val="ReportCode"/>
         <w:jc w:val="left"/>
+        <w:shd w:fill="F2F2F2"/>
       </w:pPr>
       <w:r>
         <w:t xml:space="preserve">                                      ),</w:t>
@@ -3362,6 +3539,7 @@
       <w:pPr>
         <w:pStyle w:val="ReportCode"/>
         <w:jc w:val="left"/>
+        <w:shd w:fill="F2F2F2"/>
       </w:pPr>
       <w:r>
         <w:t xml:space="preserve">                                    ),</w:t>
@@ -3371,6 +3549,7 @@
       <w:pPr>
         <w:pStyle w:val="ReportCode"/>
         <w:jc w:val="left"/>
+        <w:shd w:fill="F2F2F2"/>
       </w:pPr>
       <w:r>
         <w:t xml:space="preserve">                                  ),</w:t>
@@ -3380,6 +3559,7 @@
       <w:pPr>
         <w:pStyle w:val="ReportCode"/>
         <w:jc w:val="left"/>
+        <w:shd w:fill="F2F2F2"/>
       </w:pPr>
       <w:r>
         <w:t xml:space="preserve">                                  const SizedBox(height: 5),</w:t>
@@ -3389,6 +3569,7 @@
       <w:pPr>
         <w:pStyle w:val="ReportCode"/>
         <w:jc w:val="left"/>
+        <w:shd w:fill="F2F2F2"/>
       </w:pPr>
       <w:r>
         <w:t xml:space="preserve">                                  Text(</w:t>
@@ -3398,6 +3579,7 @@
       <w:pPr>
         <w:pStyle w:val="ReportCode"/>
         <w:jc w:val="left"/>
+        <w:shd w:fill="F2F2F2"/>
       </w:pPr>
       <w:r>
         <w:t xml:space="preserve">                                    language.name,</w:t>
@@ -3407,6 +3589,7 @@
       <w:pPr>
         <w:pStyle w:val="ReportCode"/>
         <w:jc w:val="left"/>
+        <w:shd w:fill="F2F2F2"/>
       </w:pPr>
       <w:r>
         <w:t xml:space="preserve">                                    style: const TextStyle(</w:t>
@@ -3416,6 +3599,7 @@
       <w:pPr>
         <w:pStyle w:val="ReportCode"/>
         <w:jc w:val="left"/>
+        <w:shd w:fill="F2F2F2"/>
       </w:pPr>
       <w:r>
         <w:t xml:space="preserve">                                      fontWeight: FontWeight.w600,</w:t>
@@ -3425,6 +3609,7 @@
       <w:pPr>
         <w:pStyle w:val="ReportCode"/>
         <w:jc w:val="left"/>
+        <w:shd w:fill="F2F2F2"/>
       </w:pPr>
       <w:r>
         <w:t xml:space="preserve">                                    ),</w:t>
@@ -3434,6 +3619,7 @@
       <w:pPr>
         <w:pStyle w:val="ReportCode"/>
         <w:jc w:val="left"/>
+        <w:shd w:fill="F2F2F2"/>
       </w:pPr>
       <w:r>
         <w:t xml:space="preserve">                                  ),</w:t>
@@ -3443,6 +3629,7 @@
       <w:pPr>
         <w:pStyle w:val="ReportCode"/>
         <w:jc w:val="left"/>
+        <w:shd w:fill="F2F2F2"/>
       </w:pPr>
       <w:r>
         <w:t xml:space="preserve">                                ],</w:t>
@@ -3452,6 +3639,7 @@
       <w:pPr>
         <w:pStyle w:val="ReportCode"/>
         <w:jc w:val="left"/>
+        <w:shd w:fill="F2F2F2"/>
       </w:pPr>
       <w:r>
         <w:t xml:space="preserve">                              ),</w:t>
@@ -3461,6 +3649,7 @@
       <w:pPr>
         <w:pStyle w:val="ReportCode"/>
         <w:jc w:val="left"/>
+        <w:shd w:fill="F2F2F2"/>
       </w:pPr>
       <w:r>
         <w:t xml:space="preserve">                            ),</w:t>
@@ -3470,6 +3659,7 @@
       <w:pPr>
         <w:pStyle w:val="ReportCode"/>
         <w:jc w:val="left"/>
+        <w:shd w:fill="F2F2F2"/>
       </w:pPr>
       <w:r>
         <w:t xml:space="preserve">                          ),</w:t>
@@ -3479,6 +3669,7 @@
       <w:pPr>
         <w:pStyle w:val="ReportCode"/>
         <w:jc w:val="left"/>
+        <w:shd w:fill="F2F2F2"/>
       </w:pPr>
       <w:r>
         <w:t xml:space="preserve">                        );</w:t>
@@ -3488,6 +3679,7 @@
       <w:pPr>
         <w:pStyle w:val="ReportCode"/>
         <w:jc w:val="left"/>
+        <w:shd w:fill="F2F2F2"/>
       </w:pPr>
       <w:r>
         <w:t xml:space="preserve">                      },</w:t>
@@ -3497,6 +3689,7 @@
       <w:pPr>
         <w:pStyle w:val="ReportCode"/>
         <w:jc w:val="left"/>
+        <w:shd w:fill="F2F2F2"/>
       </w:pPr>
       <w:r>
         <w:t xml:space="preserve">                    ),</w:t>
@@ -3506,6 +3699,7 @@
       <w:pPr>
         <w:pStyle w:val="ReportCode"/>
         <w:jc w:val="left"/>
+        <w:shd w:fill="F2F2F2"/>
       </w:pPr>
       <w:r>
         <w:t xml:space="preserve">                  ),</w:t>
@@ -3515,6 +3709,7 @@
       <w:pPr>
         <w:pStyle w:val="ReportCode"/>
         <w:jc w:val="left"/>
+        <w:shd w:fill="F2F2F2"/>
       </w:pPr>
       <w:r>
         <w:t xml:space="preserve">                  const SizedBox(height: 12),</w:t>
@@ -3524,6 +3719,7 @@
       <w:pPr>
         <w:pStyle w:val="ReportCode"/>
         <w:jc w:val="left"/>
+        <w:shd w:fill="F2F2F2"/>
       </w:pPr>
       <w:r>
         <w:t xml:space="preserve">                  const Text(</w:t>
@@ -3533,6 +3729,7 @@
       <w:pPr>
         <w:pStyle w:val="ReportCode"/>
         <w:jc w:val="left"/>
+        <w:shd w:fill="F2F2F2"/>
       </w:pPr>
       <w:r>
         <w:t xml:space="preserve">                    'Выберите язык',</w:t>
@@ -3542,6 +3739,7 @@
       <w:pPr>
         <w:pStyle w:val="ReportCode"/>
         <w:jc w:val="left"/>
+        <w:shd w:fill="F2F2F2"/>
       </w:pPr>
       <w:r>
         <w:t xml:space="preserve">                    style: TextStyle(fontSize: 16, fontWeight: FontWeight.bold),</w:t>
@@ -3551,6 +3749,7 @@
       <w:pPr>
         <w:pStyle w:val="ReportCode"/>
         <w:jc w:val="left"/>
+        <w:shd w:fill="F2F2F2"/>
       </w:pPr>
       <w:r>
         <w:t xml:space="preserve">                  ),</w:t>
@@ -3560,6 +3759,7 @@
       <w:pPr>
         <w:pStyle w:val="ReportCode"/>
         <w:jc w:val="left"/>
+        <w:shd w:fill="F2F2F2"/>
       </w:pPr>
       <w:r>
         <w:t xml:space="preserve">                  const SizedBox(height: 5),</w:t>
@@ -3569,6 +3769,7 @@
       <w:pPr>
         <w:pStyle w:val="ReportCode"/>
         <w:jc w:val="left"/>
+        <w:shd w:fill="F2F2F2"/>
       </w:pPr>
       <w:r>
         <w:t xml:space="preserve">                  Expanded(</w:t>
@@ -3577,8 +3778,9 @@
     <w:p>
       <w:pPr>
         <w:pStyle w:val="ReportCode"/>
+        <w:jc w:val="left"/>
         <w:keepNext/>
-        <w:jc w:val="left"/>
+        <w:shd w:fill="F2F2F2"/>
       </w:pPr>
       <w:r>
         <w:t xml:space="preserve">                    // Вертикальный список занимает оставшееся место экрана.</w:t>
@@ -3588,6 +3790,7 @@
       <w:pPr>
         <w:pStyle w:val="ReportCode"/>
         <w:jc w:val="left"/>
+        <w:shd w:fill="F2F2F2"/>
       </w:pPr>
       <w:r>
         <w:t xml:space="preserve">                    child: ListView.builder(</w:t>
@@ -3597,6 +3800,7 @@
       <w:pPr>
         <w:pStyle w:val="ReportCode"/>
         <w:jc w:val="left"/>
+        <w:shd w:fill="F2F2F2"/>
       </w:pPr>
       <w:r>
         <w:t xml:space="preserve">                      key: const Key('language-list'),</w:t>
@@ -3606,6 +3810,7 @@
       <w:pPr>
         <w:pStyle w:val="ReportCode"/>
         <w:jc w:val="left"/>
+        <w:shd w:fill="F2F2F2"/>
       </w:pPr>
       <w:r>
         <w:t xml:space="preserve">                      itemCount: languages.length,</w:t>
@@ -3615,6 +3820,7 @@
       <w:pPr>
         <w:pStyle w:val="ReportCode"/>
         <w:jc w:val="left"/>
+        <w:shd w:fill="F2F2F2"/>
       </w:pPr>
       <w:r>
         <w:t xml:space="preserve">                      itemBuilder: (context, index) {</w:t>
@@ -3624,6 +3830,7 @@
       <w:pPr>
         <w:pStyle w:val="ReportCode"/>
         <w:jc w:val="left"/>
+        <w:shd w:fill="F2F2F2"/>
       </w:pPr>
       <w:r>
         <w:t xml:space="preserve">                        final language = languages[index];</w:t>
@@ -3633,6 +3840,7 @@
       <w:pPr>
         <w:pStyle w:val="ReportCode"/>
         <w:jc w:val="left"/>
+        <w:shd w:fill="F2F2F2"/>
       </w:pPr>
       <w:r>
         <w:t xml:space="preserve">                        return Card(</w:t>
@@ -3656,6 +3864,7 @@
       <w:pPr>
         <w:pStyle w:val="ReportCode"/>
         <w:jc w:val="left"/>
+        <w:shd w:fill="F2F2F2"/>
       </w:pPr>
       <w:r>
         <w:t xml:space="preserve">                          key: Key('language-card-$index'),</w:t>
@@ -3665,6 +3874,7 @@
       <w:pPr>
         <w:pStyle w:val="ReportCode"/>
         <w:jc w:val="left"/>
+        <w:shd w:fill="F2F2F2"/>
       </w:pPr>
       <w:r>
         <w:t xml:space="preserve">                          color: _selectedIndex == index</w:t>
@@ -3674,6 +3884,7 @@
       <w:pPr>
         <w:pStyle w:val="ReportCode"/>
         <w:jc w:val="left"/>
+        <w:shd w:fill="F2F2F2"/>
       </w:pPr>
       <w:r>
         <w:t xml:space="preserve">                              ? const Color(0xFFE9F6E8)</w:t>
@@ -3683,6 +3894,7 @@
       <w:pPr>
         <w:pStyle w:val="ReportCode"/>
         <w:jc w:val="left"/>
+        <w:shd w:fill="F2F2F2"/>
       </w:pPr>
       <w:r>
         <w:t xml:space="preserve">                              : null,</w:t>
@@ -3692,6 +3904,7 @@
       <w:pPr>
         <w:pStyle w:val="ReportCode"/>
         <w:jc w:val="left"/>
+        <w:shd w:fill="F2F2F2"/>
       </w:pPr>
       <w:r>
         <w:t xml:space="preserve">                          child: ListTile(</w:t>
@@ -3701,6 +3914,7 @@
       <w:pPr>
         <w:pStyle w:val="ReportCode"/>
         <w:jc w:val="left"/>
+        <w:shd w:fill="F2F2F2"/>
       </w:pPr>
       <w:r>
         <w:t xml:space="preserve">                            leading: Icon(</w:t>
@@ -3710,6 +3924,7 @@
       <w:pPr>
         <w:pStyle w:val="ReportCode"/>
         <w:jc w:val="left"/>
+        <w:shd w:fill="F2F2F2"/>
       </w:pPr>
       <w:r>
         <w:t xml:space="preserve">                              language.icon,</w:t>
@@ -3719,6 +3934,7 @@
       <w:pPr>
         <w:pStyle w:val="ReportCode"/>
         <w:jc w:val="left"/>
+        <w:shd w:fill="F2F2F2"/>
       </w:pPr>
       <w:r>
         <w:t xml:space="preserve">                              color: Colors.green.shade700,</w:t>
@@ -3728,6 +3944,7 @@
       <w:pPr>
         <w:pStyle w:val="ReportCode"/>
         <w:jc w:val="left"/>
+        <w:shd w:fill="F2F2F2"/>
       </w:pPr>
       <w:r>
         <w:t xml:space="preserve">                            ),</w:t>
@@ -3737,6 +3954,7 @@
       <w:pPr>
         <w:pStyle w:val="ReportCode"/>
         <w:jc w:val="left"/>
+        <w:shd w:fill="F2F2F2"/>
       </w:pPr>
       <w:r>
         <w:t xml:space="preserve">                            title: Text(language.name),</w:t>
@@ -3746,6 +3964,7 @@
       <w:pPr>
         <w:pStyle w:val="ReportCode"/>
         <w:jc w:val="left"/>
+        <w:shd w:fill="F2F2F2"/>
       </w:pPr>
       <w:r>
         <w:t xml:space="preserve">                            subtitle: Text(language.description),</w:t>
@@ -3755,6 +3974,7 @@
       <w:pPr>
         <w:pStyle w:val="ReportCode"/>
         <w:jc w:val="left"/>
+        <w:shd w:fill="F2F2F2"/>
       </w:pPr>
       <w:r>
         <w:t xml:space="preserve">                            trailing: const Icon(Icons.chevron_right),</w:t>
@@ -3764,6 +3984,7 @@
       <w:pPr>
         <w:pStyle w:val="ReportCode"/>
         <w:jc w:val="left"/>
+        <w:shd w:fill="F2F2F2"/>
       </w:pPr>
       <w:r>
         <w:t xml:space="preserve">                            onTap: () =&gt; _selectLanguage(index),</w:t>
@@ -3773,6 +3994,7 @@
       <w:pPr>
         <w:pStyle w:val="ReportCode"/>
         <w:jc w:val="left"/>
+        <w:shd w:fill="F2F2F2"/>
       </w:pPr>
       <w:r>
         <w:t xml:space="preserve">                          ),</w:t>
@@ -3782,6 +4004,7 @@
       <w:pPr>
         <w:pStyle w:val="ReportCode"/>
         <w:jc w:val="left"/>
+        <w:shd w:fill="F2F2F2"/>
       </w:pPr>
       <w:r>
         <w:t xml:space="preserve">                        );</w:t>
@@ -3791,6 +4014,7 @@
       <w:pPr>
         <w:pStyle w:val="ReportCode"/>
         <w:jc w:val="left"/>
+        <w:shd w:fill="F2F2F2"/>
       </w:pPr>
       <w:r>
         <w:t xml:space="preserve">                      },</w:t>
@@ -3800,6 +4024,7 @@
       <w:pPr>
         <w:pStyle w:val="ReportCode"/>
         <w:jc w:val="left"/>
+        <w:shd w:fill="F2F2F2"/>
       </w:pPr>
       <w:r>
         <w:t xml:space="preserve">                    ),</w:t>
@@ -3809,6 +4034,7 @@
       <w:pPr>
         <w:pStyle w:val="ReportCode"/>
         <w:jc w:val="left"/>
+        <w:shd w:fill="F2F2F2"/>
       </w:pPr>
       <w:r>
         <w:t xml:space="preserve">                  ),</w:t>
@@ -3818,6 +4044,7 @@
       <w:pPr>
         <w:pStyle w:val="ReportCode"/>
         <w:jc w:val="left"/>
+        <w:shd w:fill="F2F2F2"/>
       </w:pPr>
       <w:r>
         <w:t xml:space="preserve">                  const Divider(height: 12),</w:t>
@@ -3827,6 +4054,7 @@
       <w:pPr>
         <w:pStyle w:val="ReportCode"/>
         <w:jc w:val="left"/>
+        <w:shd w:fill="F2F2F2"/>
       </w:pPr>
       <w:r>
         <w:t xml:space="preserve">                  const Row(</w:t>
@@ -3836,6 +4064,7 @@
       <w:pPr>
         <w:pStyle w:val="ReportCode"/>
         <w:jc w:val="left"/>
+        <w:shd w:fill="F2F2F2"/>
       </w:pPr>
       <w:r>
         <w:t xml:space="preserve">                    children: [</w:t>
@@ -3845,6 +4074,7 @@
       <w:pPr>
         <w:pStyle w:val="ReportCode"/>
         <w:jc w:val="left"/>
+        <w:shd w:fill="F2F2F2"/>
       </w:pPr>
       <w:r>
         <w:t xml:space="preserve">                      Icon(Icons.person_outline, color: Colors.green),</w:t>
@@ -3854,6 +4084,7 @@
       <w:pPr>
         <w:pStyle w:val="ReportCode"/>
         <w:jc w:val="left"/>
+        <w:shd w:fill="F2F2F2"/>
       </w:pPr>
       <w:r>
         <w:t xml:space="preserve">                      SizedBox(width: 10),</w:t>
@@ -3863,6 +4094,7 @@
       <w:pPr>
         <w:pStyle w:val="ReportCode"/>
         <w:jc w:val="left"/>
+        <w:shd w:fill="F2F2F2"/>
       </w:pPr>
       <w:r>
         <w:t xml:space="preserve">                      Expanded(</w:t>
@@ -3872,6 +4104,7 @@
       <w:pPr>
         <w:pStyle w:val="ReportCode"/>
         <w:jc w:val="left"/>
+        <w:shd w:fill="F2F2F2"/>
       </w:pPr>
       <w:r>
         <w:t xml:space="preserve">                        child: Text(</w:t>
@@ -3881,6 +4114,7 @@
       <w:pPr>
         <w:pStyle w:val="ReportCode"/>
         <w:jc w:val="left"/>
+        <w:shd w:fill="F2F2F2"/>
       </w:pPr>
       <w:r>
         <w:t xml:space="preserve">                          'Полянский Максим Дмитриевич · ИКБО-65-23',</w:t>
@@ -3890,6 +4124,7 @@
       <w:pPr>
         <w:pStyle w:val="ReportCode"/>
         <w:jc w:val="left"/>
+        <w:shd w:fill="F2F2F2"/>
       </w:pPr>
       <w:r>
         <w:t xml:space="preserve">                          style: TextStyle(fontSize: 13),</w:t>
@@ -3899,6 +4134,7 @@
       <w:pPr>
         <w:pStyle w:val="ReportCode"/>
         <w:jc w:val="left"/>
+        <w:shd w:fill="F2F2F2"/>
       </w:pPr>
       <w:r>
         <w:t xml:space="preserve">                        ),</w:t>
@@ -3908,6 +4144,7 @@
       <w:pPr>
         <w:pStyle w:val="ReportCode"/>
         <w:jc w:val="left"/>
+        <w:shd w:fill="F2F2F2"/>
       </w:pPr>
       <w:r>
         <w:t xml:space="preserve">                      ),</w:t>
@@ -3917,6 +4154,7 @@
       <w:pPr>
         <w:pStyle w:val="ReportCode"/>
         <w:jc w:val="left"/>
+        <w:shd w:fill="F2F2F2"/>
       </w:pPr>
       <w:r>
         <w:t xml:space="preserve">                    ],</w:t>
@@ -3926,6 +4164,7 @@
       <w:pPr>
         <w:pStyle w:val="ReportCode"/>
         <w:jc w:val="left"/>
+        <w:shd w:fill="F2F2F2"/>
       </w:pPr>
       <w:r>
         <w:t xml:space="preserve">                  ),</w:t>
@@ -3935,6 +4174,7 @@
       <w:pPr>
         <w:pStyle w:val="ReportCode"/>
         <w:jc w:val="left"/>
+        <w:shd w:fill="F2F2F2"/>
       </w:pPr>
       <w:r>
         <w:t xml:space="preserve">                ],</w:t>
@@ -3944,6 +4184,7 @@
       <w:pPr>
         <w:pStyle w:val="ReportCode"/>
         <w:jc w:val="left"/>
+        <w:shd w:fill="F2F2F2"/>
       </w:pPr>
       <w:r>
         <w:t xml:space="preserve">              ),</w:t>
@@ -3953,6 +4194,7 @@
       <w:pPr>
         <w:pStyle w:val="ReportCode"/>
         <w:jc w:val="left"/>
+        <w:shd w:fill="F2F2F2"/>
       </w:pPr>
       <w:r>
         <w:t xml:space="preserve">            );</w:t>
@@ -3962,6 +4204,7 @@
       <w:pPr>
         <w:pStyle w:val="ReportCode"/>
         <w:jc w:val="left"/>
+        <w:shd w:fill="F2F2F2"/>
       </w:pPr>
       <w:r>
         <w:t xml:space="preserve">          },</w:t>
@@ -3971,6 +4214,7 @@
       <w:pPr>
         <w:pStyle w:val="ReportCode"/>
         <w:jc w:val="left"/>
+        <w:shd w:fill="F2F2F2"/>
       </w:pPr>
       <w:r>
         <w:t xml:space="preserve">        ),</w:t>
@@ -3980,6 +4224,7 @@
       <w:pPr>
         <w:pStyle w:val="ReportCode"/>
         <w:jc w:val="left"/>
+        <w:shd w:fill="F2F2F2"/>
       </w:pPr>
       <w:r>
         <w:t xml:space="preserve">      ),</w:t>
@@ -3989,6 +4234,7 @@
       <w:pPr>
         <w:pStyle w:val="ReportCode"/>
         <w:jc w:val="left"/>
+        <w:shd w:fill="F2F2F2"/>
       </w:pPr>
       <w:r>
         <w:t xml:space="preserve">    );</w:t>
@@ -3998,6 +4244,7 @@
       <w:pPr>
         <w:pStyle w:val="ReportCode"/>
         <w:jc w:val="left"/>
+        <w:shd w:fill="F2F2F2"/>
       </w:pPr>
       <w:r>
         <w:t xml:space="preserve">  }</w:t>
@@ -4007,6 +4254,7 @@
       <w:pPr>
         <w:pStyle w:val="ReportCode"/>
         <w:jc w:val="left"/>
+        <w:shd w:fill="F2F2F2"/>
       </w:pPr>
       <w:r>
         <w:t>}</w:t>
@@ -4039,6 +4287,7 @@
       <w:pPr>
         <w:pStyle w:val="ReportCode"/>
         <w:jc w:val="left"/>
+        <w:shd w:fill="F2F2F2"/>
       </w:pPr>
       <w:r>
         <w:t>flutter:</w:t>
@@ -4048,6 +4297,7 @@
       <w:pPr>
         <w:pStyle w:val="ReportCode"/>
         <w:jc w:val="left"/>
+        <w:shd w:fill="F2F2F2"/>
       </w:pPr>
       <w:r>
         <w:t xml:space="preserve">  uses-material-design: true</w:t>
@@ -4057,6 +4307,7 @@
       <w:pPr>
         <w:pStyle w:val="ReportCode"/>
         <w:jc w:val="left"/>
+        <w:shd w:fill="F2F2F2"/>
       </w:pPr>
       <w:r>
         <w:t xml:space="preserve">  assets:</w:t>
@@ -4066,6 +4317,7 @@
       <w:pPr>
         <w:pStyle w:val="ReportCode"/>
         <w:jc w:val="left"/>
+        <w:shd w:fill="F2F2F2"/>
       </w:pPr>
       <w:r>
         <w:t xml:space="preserve">    - assets/images/</w:t>
@@ -4075,6 +4327,7 @@
       <w:pPr>
         <w:pStyle w:val="ReportCode"/>
         <w:jc w:val="left"/>
+        <w:shd w:fill="F2F2F2"/>
       </w:pPr>
       <w:r>
         <w:t xml:space="preserve">  fonts:</w:t>
@@ -4084,6 +4337,7 @@
       <w:pPr>
         <w:pStyle w:val="ReportCode"/>
         <w:jc w:val="left"/>
+        <w:shd w:fill="F2F2F2"/>
       </w:pPr>
       <w:r>
         <w:t xml:space="preserve">    - family: NotoSansCustom</w:t>
@@ -4093,6 +4347,7 @@
       <w:pPr>
         <w:pStyle w:val="ReportCode"/>
         <w:jc w:val="left"/>
+        <w:shd w:fill="F2F2F2"/>
       </w:pPr>
       <w:r>
         <w:t xml:space="preserve">      fonts:</w:t>
@@ -4102,6 +4357,7 @@
       <w:pPr>
         <w:pStyle w:val="ReportCode"/>
         <w:jc w:val="left"/>
+        <w:shd w:fill="F2F2F2"/>
       </w:pPr>
       <w:r>
         <w:t xml:space="preserve">        - asset: assets/fonts/NotoSans-Bold.ttf</w:t>
@@ -4111,6 +4367,7 @@
       <w:pPr>
         <w:pStyle w:val="ReportCode"/>
         <w:jc w:val="left"/>
+        <w:shd w:fill="F2F2F2"/>
       </w:pPr>
       <w:r>
         <w:t xml:space="preserve">          weight: 700</w:t>
@@ -4131,7 +4388,7 @@
         <w:jc w:val="both"/>
       </w:pPr>
       <w:r>
-        <w:t>Команда flutter analyze завершилась сообщением No issues found. Команда flutter test прошла три сценария: горизонтальная прокрутка галереи и наличие ClipRRect; выбор карточек Dart и JavaScript с проверкой текста SnackBar; работа при размере 320 × 480 пикселей без ошибок компоновки. В браузере отдельно проверены начальное состояние, конец галереи, вертикальная прокрутка и оба уведомления. Ошибок страницы при взаимодействиях не возникло.</w:t>
+        <w:t>Проверка flutter analyze не выявила замечаний. Все три теста прошли: галерея прокручивается и показывает изображения со скруглёнными углами; выбор Dart и JavaScript выводит правильное уведомление; в небольшом окне элементы экрана не перекрывают друг друга. В браузере я также проверил обе прокрутки и нажатие на карточки.</w:t>
       </w:r>
     </w:p>
     <w:p>
@@ -4140,7 +4397,7 @@
         <w:jc w:val="both"/>
       </w:pPr>
       <w:r>
-        <w:t>Команда flutter build apk --debug создала установочный Android APK. Сборка подтверждает получение файла, но не является проверкой запуска на Android-устройстве. Основная демонстрация и скриншоты выполнены в Google Chrome.</w:t>
+        <w:t>Команда flutter build apk --debug успешно создала Android APK. Скриншоты в отчёте сделаны в запущенной веб-версии приложения.</w:t>
       </w:r>
     </w:p>
     <w:p>
@@ -4189,143 +4446,21 @@
       </w:r>
     </w:p>
     <w:p>
-      <w:r>
-        <w:br w:type="page"/>
-      </w:r>
-    </w:p>
-    <w:p>
       <w:pPr>
         <w:pStyle w:val="ReportHeading"/>
         <w:jc w:val="left"/>
       </w:pPr>
       <w:r>
-        <w:t>13 Пояснения для защиты</w:t>
+        <w:t>13 Вывод</w:t>
       </w:r>
     </w:p>
     <w:p>
       <w:pPr>
         <w:pStyle w:val="ReportBody"/>
-        <w:spacing w:line="252" w:lineRule="auto"/>
-        <w:jc w:val="left"/>
-      </w:pPr>
-      <w:r>
-        <w:rPr>
-          <w:sz w:val="26"/>
-        </w:rPr>
-        <w:t>Почему у галереи установлен scrollDirection: Axis.horizontal? По умолчанию ListView прокручивается вертикально. Этот параметр меняет направление прокрутки только галереи; второй ListView остаётся вертикальным.</w:t>
-      </w:r>
-    </w:p>
-    <w:p>
-      <w:pPr>
-        <w:pStyle w:val="ReportBody"/>
-        <w:spacing w:line="252" w:lineRule="auto"/>
-        <w:jc w:val="left"/>
-      </w:pPr>
-      <w:r>
-        <w:rPr>
-          <w:sz w:val="26"/>
-        </w:rPr>
-        <w:t>Зачем SizedBox вокруг горизонтального ListView? Внутри Column список должен получить конечную высоту. SizedBox задаёт её, поэтому карточки с изображениями корректно размещаются и прокручиваются.</w:t>
-      </w:r>
-    </w:p>
-    <w:p>
-      <w:pPr>
-        <w:pStyle w:val="ReportBody"/>
-        <w:spacing w:line="252" w:lineRule="auto"/>
-        <w:jc w:val="left"/>
-      </w:pPr>
-      <w:r>
-        <w:rPr>
-          <w:sz w:val="26"/>
-        </w:rPr>
-        <w:t>Для чего itemCount и itemBuilder? itemCount сообщает число элементов, а itemBuilder по индексу создаёт видимый элемент. В обоих списках используется languages.length и один массив LanguageInfo, поэтому названия и картинки согласованы.</w:t>
-      </w:r>
-    </w:p>
-    <w:p>
-      <w:pPr>
-        <w:pStyle w:val="ReportBody"/>
-        <w:spacing w:line="252" w:lineRule="auto"/>
-        <w:jc w:val="left"/>
-      </w:pPr>
-      <w:r>
-        <w:rPr>
-          <w:sz w:val="26"/>
-        </w:rPr>
-        <w:t>Что делает ClipRRect? Он обрезает именно содержимое картинки по скруглённому прямоугольнику. Один только BorderRadius в оформлении Card не гарантирует обрезку изображения.</w:t>
-      </w:r>
-    </w:p>
-    <w:p>
-      <w:pPr>
-        <w:pStyle w:val="ReportBody"/>
-        <w:spacing w:line="252" w:lineRule="auto"/>
-        <w:jc w:val="left"/>
-      </w:pPr>
-      <w:r>
-        <w:rPr>
-          <w:sz w:val="26"/>
-        </w:rPr>
-        <w:t>Чем Card отличается от ListTile? Card оформляет фон и форму карточки; ListTile задаёт готовую структуру строки с leading, title, subtitle, trailing и обработчиком onTap.</w:t>
-      </w:r>
-    </w:p>
-    <w:p>
-      <w:pPr>
-        <w:pStyle w:val="ReportBody"/>
-        <w:spacing w:line="252" w:lineRule="auto"/>
-        <w:jc w:val="left"/>
-      </w:pPr>
-      <w:r>
-        <w:rPr>
-          <w:sz w:val="26"/>
-        </w:rPr>
-        <w:t>Почему используется StatefulWidget? После выбора карточки меняется _selectedIndex, и setState() перестраивает список, чтобы выделить нужную карточку. Для одного SnackBar состояние не требовалось бы, но оно нужно для подсветки.</w:t>
-      </w:r>
-    </w:p>
-    <w:p>
-      <w:pPr>
-        <w:pStyle w:val="ReportBody"/>
-        <w:spacing w:line="252" w:lineRule="auto"/>
-        <w:jc w:val="left"/>
-      </w:pPr>
-      <w:r>
-        <w:rPr>
-          <w:sz w:val="26"/>
-        </w:rPr>
-        <w:t>Как появляется SnackBar? Метод ScaffoldMessenger.of(context).showSnackBar() показывает сообщение поверх Scaffold. В content передаётся Text с languages[index].name. Перед показом удаляется прежний SnackBar, чтобы новое сообщение не стояло в очереди.</w:t>
-      </w:r>
-    </w:p>
-    <w:p>
-      <w:pPr>
-        <w:pStyle w:val="ReportBody"/>
-        <w:spacing w:line="252" w:lineRule="auto"/>
-        <w:jc w:val="left"/>
-      </w:pPr>
-      <w:r>
-        <w:rPr>
-          <w:sz w:val="26"/>
-        </w:rPr>
-        <w:t>Почему на коротком экране всё помещается? LayoutBuilder сообщает доступную высоту, компактный режим уменьшает галерею и текст описания, а вертикальный ListView в Expanded использует оставшееся место и прокручивается.</w:t>
-      </w:r>
-    </w:p>
-    <w:p>
-      <w:pPr>
-        <w:pStyle w:val="ReportHeading"/>
-        <w:jc w:val="left"/>
-      </w:pPr>
-      <w:r>
-        <w:t>14 Вывод</w:t>
-      </w:r>
-    </w:p>
-    <w:p>
-      <w:pPr>
-        <w:pStyle w:val="ReportBody"/>
-        <w:spacing w:line="252" w:lineRule="auto"/>
-        <w:jc w:val="left"/>
-      </w:pPr>
-      <w:r>
-        <w:rPr>
-          <w:sz w:val="26"/>
-        </w:rPr>
-        <w:t>Практическая работа 4 выполнена на основе собственного приложения по теме «Языки программирования». Пять изображений представлены в горизонтальном ListView со скруглёнными углами, пять пунктов — в вертикальном ListView в форме Card и ListTile. Нажатие на карточку показывает SnackBar с её названием и подсвечивает выбранный пункт. Работа подтверждена шестью скриншотами, статическим анализом, тремя тестами и сборкой Android APK. Исходники и отчёт размещены в общем репозитории GitHub.</w:t>
+        <w:jc w:val="both"/>
+      </w:pPr>
+      <w:r>
+        <w:t>В этой работе я доработал приложение «Языки программирования»: добавил горизонтальную галерею из пяти изображений и вертикальный список карточек с краткими описаниями и иконками. При выборе карточки приложение выделяет её и показывает SnackBar с названием языка. Работу приложения подтверждают скриншоты и результаты проверок. Исходный код и отчёт опубликованы в общем репозитории GitHub.</w:t>
       </w:r>
     </w:p>
     <w:sectPr>
@@ -5598,13 +5733,13 @@
     <w:name w:val="ReportCode"/>
     <w:pPr>
       <w:keepLines/>
-      <w:spacing w:after="0" w:line="230" w:lineRule="exact"/>
-      <w:ind w:firstLine="0"/>
+      <w:spacing w:after="0" w:line="210" w:lineRule="exact"/>
+      <w:ind w:firstLine="0" w:left="198" w:right="85"/>
     </w:pPr>
     <w:rPr>
       <w:rFonts w:ascii="DejaVu Sans Mono" w:eastAsia="DejaVu Sans Mono" w:hAnsi="DejaVu Sans Mono" w:cs="DejaVu Sans Mono"/>
       <w:color w:val="000000"/>
-      <w:sz w:val="18"/>
+      <w:sz w:val="16"/>
     </w:rPr>
   </w:style>
   <w:style w:type="paragraph" w:customStyle="1" w:styleId="ReportSmall">

</xml_diff>

<commit_message>
Fix Practice 4 report screenshot and page numbering
</commit_message>
<xml_diff>
--- a/reports/Practice_4_Polyanskiy.docx
+++ b/reports/Practice_4_Polyanskiy.docx
@@ -1458,7 +1458,7 @@
         <w:jc w:val="left"/>
       </w:pPr>
       <w:r>
-        <w:t>9.3 Уведомление и работа в небольшом окне</w:t>
+        <w:t>9.3 Уведомление и прокрутка галереи</w:t>
       </w:r>
     </w:p>
     <w:p>
@@ -1467,7 +1467,7 @@
         <w:jc w:val="both"/>
       </w:pPr>
       <w:r>
-        <w:t>Слева показано уведомление после выбора Dart. Справа видно, как экран выглядит в небольшом окне: галерея и описание занимают меньше места, а список карточек остаётся доступным.</w:t>
+        <w:t>Слева показано уведомление после выбора Dart. Справа галерея прокручена к изображениям Java и C++. При этом вертикальный список остаётся на своём месте.</w:t>
       </w:r>
     </w:p>
     <w:p>
@@ -1517,7 +1517,7 @@
       <w:r>
         <w:drawing>
           <wp:inline xmlns:a="http://schemas.openxmlformats.org/drawingml/2006/main" xmlns:pic="http://schemas.openxmlformats.org/drawingml/2006/picture">
-            <wp:extent cx="2574000" cy="3861000"/>
+            <wp:extent cx="2574000" cy="4788837"/>
             <wp:docPr id="1003078101" name="Picture 1003078101"/>
             <wp:cNvGraphicFramePr>
               <a:graphicFrameLocks noChangeAspect="1"/>
@@ -1526,7 +1526,7 @@
               <a:graphicData uri="http://schemas.openxmlformats.org/drawingml/2006/picture">
                 <pic:pic>
                   <pic:nvPicPr>
-                    <pic:cNvPr id="0" name="compact.png"/>
+                    <pic:cNvPr id="0" name="gallery-scroll.png"/>
                     <pic:cNvPicPr/>
                   </pic:nvPicPr>
                   <pic:blipFill>
@@ -1538,7 +1538,7 @@
                   <pic:spPr>
                     <a:xfrm>
                       <a:off x="0" y="0"/>
-                      <a:ext cx="2574000" cy="3861000"/>
+                      <a:ext cx="2574000" cy="4788837"/>
                     </a:xfrm>
                     <a:prstGeom prst="rect"/>
                   </pic:spPr>
@@ -1555,7 +1555,7 @@
         <w:jc w:val="center"/>
       </w:pPr>
       <w:r>
-        <w:t>Рисунки 5 и 6 — Уведомление Dart и узкий экран</w:t>
+        <w:t>Рисунки 5 и 6 — Уведомление Dart и прокрутка галереи</w:t>
       </w:r>
     </w:p>
     <w:tbl>
@@ -4506,24 +4506,11 @@
     <w:pPr>
       <w:jc w:val="center"/>
     </w:pPr>
-    <w:r>
-      <w:fldChar w:fldCharType="begin"/>
-    </w:r>
-    <w:r>
-      <w:instrText>PAGE</w:instrText>
-    </w:r>
-    <w:r>
-      <w:fldChar w:fldCharType="separate"/>
-    </w:r>
-    <w:r>
-      <w:rPr>
-        <w:noProof/>
-      </w:rPr>
-      <w:t>0</w:t>
-    </w:r>
-    <w:r>
-      <w:fldChar w:fldCharType="end"/>
-    </w:r>
+    <w:fldSimple w:instr="PAGE">
+      <w:r>
+        <w:t>2</w:t>
+      </w:r>
+    </w:fldSimple>
   </w:p>
 </w:ftr>
 </file>

</xml_diff>